<commit_message>
Drop team branding from the docs and footer; keep the deck and demo video local
Removes the team and event names from the README, idea, stack, presentation,
walkthrough and site footer, removes the exported project PDF, and ignores
.ppt/.pptx/.mp4 so the deck and demo video stay out of the repo.
</commit_message>
<xml_diff>
--- a/docs/SyllabusOS_Project_Document.docx
+++ b/docs/SyllabusOS_Project_Document.docx
@@ -104,14 +104,14 @@
           <w:sz w:val="20"/>
           <w:szCs w:val="20"/>
         </w:rPr>
-        <w:t xml:space="preserve">Team Crazy Coders</w:t>
+        <w:t xml:space="preserve">Theme:</w:t>
       </w:r>
       <w:r>
         <w:rPr>
           <w:sz w:val="20"/>
           <w:szCs w:val="20"/>
         </w:rPr>
-        <w:t xml:space="preserve"> · Horizon by Hoollow — Round 1 (Online MVP) · Theme: AI with Education</w:t>
+        <w:t xml:space="preserve"> AI with Education</w:t>
       </w:r>
     </w:p>
     <w:p>
@@ -6376,7 +6376,7 @@
         <w:spacing w:after="100"/>
       </w:pPr>
       <w:r>
-        <w:t xml:space="preserve">Built by Team Crazy Coders in four lanes (AI pipelines, core engine and backend, frontend, integration and demo) with issue-per-feature branches, reviewed pull requests and CI on every push.</w:t>
+        <w:t xml:space="preserve">Built in four lanes (AI pipelines, core engine and backend, frontend, integration and demo) with issue-per-feature branches, reviewed pull requests and CI on every push.</w:t>
       </w:r>
     </w:p>
     <w:p>
@@ -6578,15 +6578,6 @@
         <w:szCs w:val="17"/>
       </w:rPr>
       <w:t xml:space="preserve"> · Project Document</w:t>
-    </w:r>
-    <w:r>
-      <w:rPr>
-        <w:color w:val="66666C"/>
-        <w:sz w:val="17"/>
-        <w:szCs w:val="17"/>
-      </w:rPr>
-      <w:tab/>
-      <w:t xml:space="preserve">Team Crazy Coders</w:t>
     </w:r>
   </w:p>
 </w:hdr>

</xml_diff>